<commit_message>
Correct Raspberry Pi memory to 8 GB
</commit_message>
<xml_diff>
--- a/docs/รายงานโครงงาน-ฉบับพร้อมส่ง.docx
+++ b/docs/รายงานโครงงาน-ฉบับพร้อมส่ง.docx
@@ -168,7 +168,7 @@
         <w:rPr>
           <w:rFonts w:ascii="Noto Sans Thai" w:hAnsi="Noto Sans Thai" w:eastAsia="Noto Sans Thai" w:cs="Noto Sans Thai"/>
         </w:rPr>
-        <w:t>โครงงาน “ใบเสร็จดี” เป็นระบบเว็บไซต์สำหรับอ่านและบันทึกข้อมูลค่าใช้จ่ายจากภาพใบเสร็จ โดยประมวลผลบน Raspberry Pi 4 RAM 4 GB ภายในเครือข่ายท้องถิ่น ผู้ใช้ถ่ายภาพด้วยโทรศัพท์และอัปโหลดผ่านเว็บ ระบบปรับภาพและอ่านตัวอักษรภาษาไทยกับภาษาอังกฤษด้วย Tesseract OCR จากนั้นใช้กฎแยกบรรทัดร่วมกับโมเดลภาษา Qwen2.5-0.5B-Instruct ซึ่งทำงานผ่าน llama.cpp เพื่อสร้างร่างข้อมูล ได้แก่ ชื่อร้านหรือชื่อลูกค้า วันที่ รายการสินค้า/บริการ จำนวน และยอดเงิน ข้อมูลทุกช่องแสดงในหน้าตรวจแก้ก่อนบันทึกลง SQLite และสรุปผลบน Dashboard</w:t>
+        <w:t>โครงงาน “ใบเสร็จดี” เป็นระบบเว็บไซต์สำหรับอ่านและบันทึกข้อมูลค่าใช้จ่ายจากภาพใบเสร็จ โดยประมวลผลบน Raspberry Pi 4 RAM 8 GB ภายในเครือข่ายท้องถิ่น ผู้ใช้ถ่ายภาพด้วยโทรศัพท์และอัปโหลดผ่านเว็บ ระบบปรับภาพและอ่านตัวอักษรภาษาไทยกับภาษาอังกฤษด้วย Tesseract OCR จากนั้นใช้กฎแยกบรรทัดร่วมกับโมเดลภาษา Qwen2.5-0.5B-Instruct ซึ่งทำงานผ่าน llama.cpp เพื่อสร้างร่างข้อมูล ได้แก่ ชื่อร้านหรือชื่อลูกค้า วันที่ รายการสินค้า/บริการ จำนวน และยอดเงิน ข้อมูลทุกช่องแสดงในหน้าตรวจแก้ก่อนบันทึกลง SQLite และสรุปผลบน Dashboard</w:t>
       </w:r>
     </w:p>
     <w:p>
@@ -378,7 +378,7 @@
         <w:rPr>
           <w:rFonts w:ascii="Noto Sans Thai" w:hAnsi="Noto Sans Thai" w:eastAsia="Noto Sans Thai" w:cs="Noto Sans Thai"/>
         </w:rPr>
-        <w:t>ทดสอบการทำงานบน Raspberry Pi 4 RAM 4 GB และบันทึกข้อจำกัดอย่างตรงไปตรงมา</w:t>
+        <w:t>ทดสอบการทำงานบน Raspberry Pi 4 RAM 8 GB และบันทึกข้อจำกัดอย่างตรงไปตรงมา</w:t>
       </w:r>
     </w:p>
     <w:p>
@@ -615,7 +615,7 @@
         <w:rPr>
           <w:rFonts w:ascii="Noto Sans Thai" w:hAnsi="Noto Sans Thai" w:eastAsia="Noto Sans Thai" w:cs="Noto Sans Thai"/>
         </w:rPr>
-        <w:t xml:space="preserve">ใช้ Qwen2.5-0.5B-Instruct รุ่น GGUF แบบ Q4_K_M ขนาดประมาณ 491 MB ผ่าน llama.cpp เนื่องจากเป็นโมเดลขนาดเล็กที่เหมาะกับหน่วยความจำจำกัด เว็บส่งเฉพาะข้อความ OCR ไปยังเซิร์ฟเวอร์โมเดลที่ </w:t>
+        <w:t xml:space="preserve">ใช้ Qwen2.5-0.5B-Instruct รุ่น GGUF แบบ Q4_K_M ขนาดประมาณ 491 MB ผ่าน llama.cpp เนื่องจากเป็นโมเดลขนาดเล็กที่ช่วยลดเวลาและภาระการประมวลผลบน CPU ของ Raspberry Pi เว็บส่งเฉพาะข้อความ OCR ไปยังเซิร์ฟเวอร์โมเดลที่ </w:t>
       </w:r>
       <w:r>
         <w:rPr>
@@ -1250,7 +1250,7 @@
                 <w:b w:val="0"/>
                 <w:sz w:val="17"/>
               </w:rPr>
-              <w:t>Raspberry Pi 4 RAM 4 GB</w:t>
+              <w:t>Raspberry Pi 4 RAM 8 GB</w:t>
             </w:r>
           </w:p>
         </w:tc>
@@ -2045,7 +2045,7 @@
                 <w:b w:val="0"/>
                 <w:sz w:val="17"/>
               </w:rPr>
-              <w:t>Raspberry Pi 4 RAM 4 GB</w:t>
+              <w:t>Raspberry Pi 4 RAM 8 GB</w:t>
             </w:r>
           </w:p>
         </w:tc>
@@ -4353,7 +4353,7 @@
         <w:rPr>
           <w:rFonts w:ascii="Noto Sans Thai" w:hAnsi="Noto Sans Thai" w:eastAsia="Noto Sans Thai" w:cs="Noto Sans Thai"/>
         </w:rPr>
-        <w:t xml:space="preserve">การติดตั้งบน Raspberry Pi 4 RAM 4 GB ผ่านขั้นตอน build llama.cpp ดาวน์โหลดโมเดล เริ่ม Local LLM และเริ่มเว็บ ค่า readiness ของเว็บ ฐานข้อมูล OCR และ AI แสดง </w:t>
+        <w:t xml:space="preserve">การติดตั้งบน Raspberry Pi 4 RAM 8 GB ผ่านขั้นตอน build llama.cpp ดาวน์โหลดโมเดล เริ่ม Local LLM และเริ่มเว็บ ค่า readiness ของเว็บ ฐานข้อมูล OCR และ AI แสดง </w:t>
       </w:r>
       <w:r>
         <w:rPr>

</xml_diff>